<commit_message>
docs: actualiza RETOMAR.md con cierre de sesión 9 + sincroniza JSON
RETOMAR.md ampliado y reorganizado en 8 secciones:
1. Sitio público en GitHub Pages (10 páginas, URL live)
2. Estado de datos (panel v12, 125 RDS)
3. Próximos pasos al retomar (carta MEFP, regresiones v12, DEA)
4. Comandos rápidos (con LANG UTF-8)
5. Convenciones del proyecto (panel v12 canónico, post_ley393)
6. 8 hallazgos cuantitativos para el reporte
7. Archivos clave para retomar contexto
8. Bugs corregidos en sesión 9 (no repetir)

Sincronización menor: docs/downloads/timeline.json con la versión
UTF-8 limpia (mismos contenidos que docs/timeline.json).

Co-Authored-By: Claude Sonnet 4.6 <noreply@anthropic.com>
</commit_message>
<xml_diff>
--- a/00_admin/Anexo_C_Acuerdo_Confidencialidad.docx
+++ b/00_admin/Anexo_C_Acuerdo_Confidencialidad.docx
@@ -2973,4 +2973,268 @@
     </a:ext>
   </a:extLst>
 </a:theme>
+</file>
+
+<file path=customXml/item1.xml><?xml version="1.0" encoding="utf-8"?>
+<ct:contentTypeSchema xmlns:ct="http://schemas.microsoft.com/office/2006/metadata/contentType" xmlns:ma="http://schemas.microsoft.com/office/2006/metadata/properties/metaAttributes" ct:_="" ma:_="" ma:contentTypeName="Document" ma:contentTypeID="0x010100EAB170F55A8EC74185BD611F05A04793" ma:contentTypeVersion="16" ma:contentTypeDescription="Create a new document." ma:contentTypeScope="" ma:versionID="3cb44b77b5141ffdb9b2bf347b988578">
+  <xsd:schema xmlns:xsd="http://www.w3.org/2001/XMLSchema" xmlns:xs="http://www.w3.org/2001/XMLSchema" xmlns:p="http://schemas.microsoft.com/office/2006/metadata/properties" xmlns:ns1="http://schemas.microsoft.com/sharepoint/v3" xmlns:ns2="53729c01-e331-46af-8f84-09bea977ed00" xmlns:ns3="0b6a0b30-4523-4899-95a0-946babcdb6cb" targetNamespace="http://schemas.microsoft.com/office/2006/metadata/properties" ma:root="true" ma:fieldsID="13d8d5c55ea586b5b753ed3878dad629" ns1:_="" ns2:_="" ns3:_="">
+    <xsd:import namespace="http://schemas.microsoft.com/sharepoint/v3"/>
+    <xsd:import namespace="53729c01-e331-46af-8f84-09bea977ed00"/>
+    <xsd:import namespace="0b6a0b30-4523-4899-95a0-946babcdb6cb"/>
+    <xsd:element name="properties">
+      <xsd:complexType>
+        <xsd:sequence>
+          <xsd:element name="documentManagement">
+            <xsd:complexType>
+              <xsd:all>
+                <xsd:element ref="ns2:MediaServiceMetadata" minOccurs="0"/>
+                <xsd:element ref="ns2:MediaServiceFastMetadata" minOccurs="0"/>
+                <xsd:element ref="ns2:MediaServiceSearchProperties" minOccurs="0"/>
+                <xsd:element ref="ns2:MediaServiceObjectDetectorVersions" minOccurs="0"/>
+                <xsd:element ref="ns2:MediaServiceDateTaken" minOccurs="0"/>
+                <xsd:element ref="ns2:MediaServiceGenerationTime" minOccurs="0"/>
+                <xsd:element ref="ns2:MediaServiceEventHashCode" minOccurs="0"/>
+                <xsd:element ref="ns2:MediaLengthInSeconds" minOccurs="0"/>
+                <xsd:element ref="ns2:lcf76f155ced4ddcb4097134ff3c332f" minOccurs="0"/>
+                <xsd:element ref="ns3:TaxCatchAll" minOccurs="0"/>
+                <xsd:element ref="ns2:MediaServiceOCR" minOccurs="0"/>
+                <xsd:element ref="ns1:_ip_UnifiedCompliancePolicyProperties" minOccurs="0"/>
+                <xsd:element ref="ns1:_ip_UnifiedCompliancePolicyUIAction" minOccurs="0"/>
+                <xsd:element ref="ns2:MediaServiceLocation" minOccurs="0"/>
+                <xsd:element ref="ns2:MediaServiceBillingMetadata" minOccurs="0"/>
+              </xsd:all>
+            </xsd:complexType>
+          </xsd:element>
+        </xsd:sequence>
+      </xsd:complexType>
+    </xsd:element>
+  </xsd:schema>
+  <xsd:schema xmlns:xsd="http://www.w3.org/2001/XMLSchema" xmlns:xs="http://www.w3.org/2001/XMLSchema" xmlns:dms="http://schemas.microsoft.com/office/2006/documentManagement/types" xmlns:pc="http://schemas.microsoft.com/office/infopath/2007/PartnerControls" targetNamespace="http://schemas.microsoft.com/sharepoint/v3" elementFormDefault="qualified">
+    <xsd:import namespace="http://schemas.microsoft.com/office/2006/documentManagement/types"/>
+    <xsd:import namespace="http://schemas.microsoft.com/office/infopath/2007/PartnerControls"/>
+    <xsd:element name="_ip_UnifiedCompliancePolicyProperties" ma:index="20" nillable="true" ma:displayName="Unified Compliance Policy Properties" ma:hidden="true" ma:internalName="_ip_UnifiedCompliancePolicyProperties">
+      <xsd:simpleType>
+        <xsd:restriction base="dms:Note"/>
+      </xsd:simpleType>
+    </xsd:element>
+    <xsd:element name="_ip_UnifiedCompliancePolicyUIAction" ma:index="21" nillable="true" ma:displayName="Unified Compliance Policy UI Action" ma:hidden="true" ma:internalName="_ip_UnifiedCompliancePolicyUIAction">
+      <xsd:simpleType>
+        <xsd:restriction base="dms:Text"/>
+      </xsd:simpleType>
+    </xsd:element>
+  </xsd:schema>
+  <xsd:schema xmlns:xsd="http://www.w3.org/2001/XMLSchema" xmlns:xs="http://www.w3.org/2001/XMLSchema" xmlns:dms="http://schemas.microsoft.com/office/2006/documentManagement/types" xmlns:pc="http://schemas.microsoft.com/office/infopath/2007/PartnerControls" targetNamespace="53729c01-e331-46af-8f84-09bea977ed00" elementFormDefault="qualified">
+    <xsd:import namespace="http://schemas.microsoft.com/office/2006/documentManagement/types"/>
+    <xsd:import namespace="http://schemas.microsoft.com/office/infopath/2007/PartnerControls"/>
+    <xsd:element name="MediaServiceMetadata" ma:index="8" nillable="true" ma:displayName="MediaServiceMetadata" ma:hidden="true" ma:internalName="MediaServiceMetadata" ma:readOnly="true">
+      <xsd:simpleType>
+        <xsd:restriction base="dms:Note"/>
+      </xsd:simpleType>
+    </xsd:element>
+    <xsd:element name="MediaServiceFastMetadata" ma:index="9" nillable="true" ma:displayName="MediaServiceFastMetadata" ma:hidden="true" ma:internalName="MediaServiceFastMetadata" ma:readOnly="true">
+      <xsd:simpleType>
+        <xsd:restriction base="dms:Note"/>
+      </xsd:simpleType>
+    </xsd:element>
+    <xsd:element name="MediaServiceSearchProperties" ma:index="10" nillable="true" ma:displayName="MediaServiceSearchProperties" ma:hidden="true" ma:internalName="MediaServiceSearchProperties" ma:readOnly="true">
+      <xsd:simpleType>
+        <xsd:restriction base="dms:Note"/>
+      </xsd:simpleType>
+    </xsd:element>
+    <xsd:element name="MediaServiceObjectDetectorVersions" ma:index="11" nillable="true" ma:displayName="MediaServiceObjectDetectorVersions" ma:hidden="true" ma:indexed="true" ma:internalName="MediaServiceObjectDetectorVersions" ma:readOnly="true">
+      <xsd:simpleType>
+        <xsd:restriction base="dms:Text"/>
+      </xsd:simpleType>
+    </xsd:element>
+    <xsd:element name="MediaServiceDateTaken" ma:index="12" nillable="true" ma:displayName="MediaServiceDateTaken" ma:hidden="true" ma:indexed="true" ma:internalName="MediaServiceDateTaken" ma:readOnly="true">
+      <xsd:simpleType>
+        <xsd:restriction base="dms:Text"/>
+      </xsd:simpleType>
+    </xsd:element>
+    <xsd:element name="MediaServiceGenerationTime" ma:index="13" nillable="true" ma:displayName="MediaServiceGenerationTime" ma:hidden="true" ma:internalName="MediaServiceGenerationTime" ma:readOnly="true">
+      <xsd:simpleType>
+        <xsd:restriction base="dms:Text"/>
+      </xsd:simpleType>
+    </xsd:element>
+    <xsd:element name="MediaServiceEventHashCode" ma:index="14" nillable="true" ma:displayName="MediaServiceEventHashCode" ma:hidden="true" ma:internalName="MediaServiceEventHashCode" ma:readOnly="true">
+      <xsd:simpleType>
+        <xsd:restriction base="dms:Text"/>
+      </xsd:simpleType>
+    </xsd:element>
+    <xsd:element name="MediaLengthInSeconds" ma:index="15" nillable="true" ma:displayName="MediaLengthInSeconds" ma:hidden="true" ma:internalName="MediaLengthInSeconds" ma:readOnly="true">
+      <xsd:simpleType>
+        <xsd:restriction base="dms:Unknown"/>
+      </xsd:simpleType>
+    </xsd:element>
+    <xsd:element name="lcf76f155ced4ddcb4097134ff3c332f" ma:index="17" nillable="true" ma:taxonomy="true" ma:internalName="lcf76f155ced4ddcb4097134ff3c332f" ma:taxonomyFieldName="MediaServiceImageTags" ma:displayName="Image Tags" ma:readOnly="false" ma:fieldId="{5cf76f15-5ced-4ddc-b409-7134ff3c332f}" ma:taxonomyMulti="true" ma:sspId="0aef40d5-b715-412d-bec7-270c58122046" ma:termSetId="09814cd3-568e-fe90-9814-8d621ff8fb84" ma:anchorId="fba54fb3-c3e1-fe81-a776-ca4b69148c4d" ma:open="true" ma:isKeyword="false">
+      <xsd:complexType>
+        <xsd:sequence>
+          <xsd:element ref="pc:Terms" minOccurs="0" maxOccurs="1"/>
+        </xsd:sequence>
+      </xsd:complexType>
+    </xsd:element>
+    <xsd:element name="MediaServiceOCR" ma:index="19" nillable="true" ma:displayName="Extracted Text" ma:internalName="MediaServiceOCR" ma:readOnly="true">
+      <xsd:simpleType>
+        <xsd:restriction base="dms:Note">
+          <xsd:maxLength value="255"/>
+        </xsd:restriction>
+      </xsd:simpleType>
+    </xsd:element>
+    <xsd:element name="MediaServiceLocation" ma:index="22" nillable="true" ma:displayName="Location" ma:description="" ma:indexed="true" ma:internalName="MediaServiceLocation" ma:readOnly="true">
+      <xsd:simpleType>
+        <xsd:restriction base="dms:Text"/>
+      </xsd:simpleType>
+    </xsd:element>
+    <xsd:element name="MediaServiceBillingMetadata" ma:index="23" nillable="true" ma:displayName="MediaServiceBillingMetadata" ma:hidden="true" ma:internalName="MediaServiceBillingMetadata" ma:readOnly="true">
+      <xsd:simpleType>
+        <xsd:restriction base="dms:Note"/>
+      </xsd:simpleType>
+    </xsd:element>
+  </xsd:schema>
+  <xsd:schema xmlns:xsd="http://www.w3.org/2001/XMLSchema" xmlns:xs="http://www.w3.org/2001/XMLSchema" xmlns:dms="http://schemas.microsoft.com/office/2006/documentManagement/types" xmlns:pc="http://schemas.microsoft.com/office/infopath/2007/PartnerControls" targetNamespace="0b6a0b30-4523-4899-95a0-946babcdb6cb" elementFormDefault="qualified">
+    <xsd:import namespace="http://schemas.microsoft.com/office/2006/documentManagement/types"/>
+    <xsd:import namespace="http://schemas.microsoft.com/office/infopath/2007/PartnerControls"/>
+    <xsd:element name="TaxCatchAll" ma:index="18" nillable="true" ma:displayName="Taxonomy Catch All Column" ma:hidden="true" ma:list="{00baf980-de20-41f9-84cd-56410328c1cb}" ma:internalName="TaxCatchAll" ma:showField="CatchAllData" ma:web="0b6a0b30-4523-4899-95a0-946babcdb6cb">
+      <xsd:complexType>
+        <xsd:complexContent>
+          <xsd:extension base="dms:MultiChoiceLookup">
+            <xsd:sequence>
+              <xsd:element name="Value" type="dms:Lookup" maxOccurs="unbounded" minOccurs="0" nillable="true"/>
+            </xsd:sequence>
+          </xsd:extension>
+        </xsd:complexContent>
+      </xsd:complexType>
+    </xsd:element>
+  </xsd:schema>
+  <xsd:schema xmlns="http://schemas.openxmlformats.org/package/2006/metadata/core-properties" xmlns:xsd="http://www.w3.org/2001/XMLSchema" xmlns:xsi="http://www.w3.org/2001/XMLSchema-instance" xmlns:dc="http://purl.org/dc/elements/1.1/" xmlns:dcterms="http://purl.org/dc/terms/" xmlns:odoc="http://schemas.microsoft.com/internal/obd" targetNamespace="http://schemas.openxmlformats.org/package/2006/metadata/core-properties" elementFormDefault="qualified" attributeFormDefault="unqualified" blockDefault="#all">
+    <xsd:import namespace="http://purl.org/dc/elements/1.1/" schemaLocation="http://dublincore.org/schemas/xmls/qdc/2003/04/02/dc.xsd"/>
+    <xsd:import namespace="http://purl.org/dc/terms/" schemaLocation="http://dublincore.org/schemas/xmls/qdc/2003/04/02/dcterms.xsd"/>
+    <xsd:element name="coreProperties" type="CT_coreProperties"/>
+    <xsd:complexType name="CT_coreProperties">
+      <xsd:all>
+        <xsd:element ref="dc:creator" minOccurs="0" maxOccurs="1"/>
+        <xsd:element ref="dcterms:created" minOccurs="0" maxOccurs="1"/>
+        <xsd:element ref="dc:identifier" minOccurs="0" maxOccurs="1"/>
+        <xsd:element name="contentType" minOccurs="0" maxOccurs="1" type="xsd:string" ma:index="0" ma:displayName="Content Type"/>
+        <xsd:element ref="dc:title" minOccurs="0" maxOccurs="1" ma:index="4" ma:displayName="Title"/>
+        <xsd:element ref="dc:subject" minOccurs="0" maxOccurs="1"/>
+        <xsd:element ref="dc:description" minOccurs="0" maxOccurs="1"/>
+        <xsd:element name="keywords" minOccurs="0" maxOccurs="1" type="xsd:string"/>
+        <xsd:element ref="dc:language" minOccurs="0" maxOccurs="1"/>
+        <xsd:element name="category" minOccurs="0" maxOccurs="1" type="xsd:string"/>
+        <xsd:element name="version" minOccurs="0" maxOccurs="1" type="xsd:string"/>
+        <xsd:element name="revision" minOccurs="0" maxOccurs="1" type="xsd:string">
+          <xsd:annotation>
+            <xsd:documentation>
+                        This value indicates the number of saves or revisions. The application is responsible for updating this value after each revision.
+                    </xsd:documentation>
+          </xsd:annotation>
+        </xsd:element>
+        <xsd:element name="lastModifiedBy" minOccurs="0" maxOccurs="1" type="xsd:string"/>
+        <xsd:element ref="dcterms:modified" minOccurs="0" maxOccurs="1"/>
+        <xsd:element name="contentStatus" minOccurs="0" maxOccurs="1" type="xsd:string"/>
+      </xsd:all>
+    </xsd:complexType>
+  </xsd:schema>
+  <xs:schema xmlns:pc="http://schemas.microsoft.com/office/infopath/2007/PartnerControls" xmlns:xs="http://www.w3.org/2001/XMLSchema" targetNamespace="http://schemas.microsoft.com/office/infopath/2007/PartnerControls" elementFormDefault="qualified" attributeFormDefault="unqualified">
+    <xs:element name="Person">
+      <xs:complexType>
+        <xs:sequence>
+          <xs:element ref="pc:DisplayName" minOccurs="0"/>
+          <xs:element ref="pc:AccountId" minOccurs="0"/>
+          <xs:element ref="pc:AccountType" minOccurs="0"/>
+        </xs:sequence>
+      </xs:complexType>
+    </xs:element>
+    <xs:element name="DisplayName" type="xs:string"/>
+    <xs:element name="AccountId" type="xs:string"/>
+    <xs:element name="AccountType" type="xs:string"/>
+    <xs:element name="BDCAssociatedEntity">
+      <xs:complexType>
+        <xs:sequence>
+          <xs:element ref="pc:BDCEntity" minOccurs="0" maxOccurs="unbounded"/>
+        </xs:sequence>
+        <xs:attribute ref="pc:EntityNamespace"/>
+        <xs:attribute ref="pc:EntityName"/>
+        <xs:attribute ref="pc:SystemInstanceName"/>
+        <xs:attribute ref="pc:AssociationName"/>
+      </xs:complexType>
+    </xs:element>
+    <xs:attribute name="EntityNamespace" type="xs:string"/>
+    <xs:attribute name="EntityName" type="xs:string"/>
+    <xs:attribute name="SystemInstanceName" type="xs:string"/>
+    <xs:attribute name="AssociationName" type="xs:string"/>
+    <xs:element name="BDCEntity">
+      <xs:complexType>
+        <xs:sequence>
+          <xs:element ref="pc:EntityDisplayName" minOccurs="0"/>
+          <xs:element ref="pc:EntityInstanceReference" minOccurs="0"/>
+          <xs:element ref="pc:EntityId1" minOccurs="0"/>
+          <xs:element ref="pc:EntityId2" minOccurs="0"/>
+          <xs:element ref="pc:EntityId3" minOccurs="0"/>
+          <xs:element ref="pc:EntityId4" minOccurs="0"/>
+          <xs:element ref="pc:EntityId5" minOccurs="0"/>
+        </xs:sequence>
+      </xs:complexType>
+    </xs:element>
+    <xs:element name="EntityDisplayName" type="xs:string"/>
+    <xs:element name="EntityInstanceReference" type="xs:string"/>
+    <xs:element name="EntityId1" type="xs:string"/>
+    <xs:element name="EntityId2" type="xs:string"/>
+    <xs:element name="EntityId3" type="xs:string"/>
+    <xs:element name="EntityId4" type="xs:string"/>
+    <xs:element name="EntityId5" type="xs:string"/>
+    <xs:element name="Terms">
+      <xs:complexType>
+        <xs:sequence>
+          <xs:element ref="pc:TermInfo" minOccurs="0" maxOccurs="unbounded"/>
+        </xs:sequence>
+      </xs:complexType>
+    </xs:element>
+    <xs:element name="TermInfo">
+      <xs:complexType>
+        <xs:sequence>
+          <xs:element ref="pc:TermName" minOccurs="0"/>
+          <xs:element ref="pc:TermId" minOccurs="0"/>
+        </xs:sequence>
+      </xs:complexType>
+    </xs:element>
+    <xs:element name="TermName" type="xs:string"/>
+    <xs:element name="TermId" type="xs:string"/>
+  </xs:schema>
+</ct:contentTypeSchema>
+</file>
+
+<file path=customXml/item2.xml><?xml version="1.0" encoding="utf-8"?>
+<?mso-contentType ?>
+<FormTemplates xmlns="http://schemas.microsoft.com/sharepoint/v3/contenttype/forms">
+  <Display>DocumentLibraryForm</Display>
+  <Edit>DocumentLibraryForm</Edit>
+  <New>DocumentLibraryForm</New>
+</FormTemplates>
+</file>
+
+<file path=customXml/item3.xml><?xml version="1.0" encoding="utf-8"?>
+<p:properties xmlns:p="http://schemas.microsoft.com/office/2006/metadata/properties" xmlns:xsi="http://www.w3.org/2001/XMLSchema-instance" xmlns:pc="http://schemas.microsoft.com/office/infopath/2007/PartnerControls">
+  <documentManagement>
+    <lcf76f155ced4ddcb4097134ff3c332f xmlns="53729c01-e331-46af-8f84-09bea977ed00">
+      <Terms xmlns="http://schemas.microsoft.com/office/infopath/2007/PartnerControls"/>
+    </lcf76f155ced4ddcb4097134ff3c332f>
+    <_ip_UnifiedCompliancePolicyUIAction xmlns="http://schemas.microsoft.com/sharepoint/v3" xsi:nil="true"/>
+    <TaxCatchAll xmlns="0b6a0b30-4523-4899-95a0-946babcdb6cb" xsi:nil="true"/>
+    <_ip_UnifiedCompliancePolicyProperties xmlns="http://schemas.microsoft.com/sharepoint/v3" xsi:nil="true"/>
+  </documentManagement>
+</p:properties>
+</file>
+
+<file path=customXml/itemProps1.xml><?xml version="1.0" encoding="utf-8"?>
+<ds:datastoreItem xmlns:ds="http://schemas.openxmlformats.org/officeDocument/2006/customXml" ds:itemID="{E124B612-79A3-4EEE-9346-891B3A3BECDE}"/>
+</file>
+
+<file path=customXml/itemProps2.xml><?xml version="1.0" encoding="utf-8"?>
+<ds:datastoreItem xmlns:ds="http://schemas.openxmlformats.org/officeDocument/2006/customXml" ds:itemID="{8656686C-62B4-45D3-B192-322E3AF81BFD}"/>
+</file>
+
+<file path=customXml/itemProps3.xml><?xml version="1.0" encoding="utf-8"?>
+<ds:datastoreItem xmlns:ds="http://schemas.openxmlformats.org/officeDocument/2006/customXml" ds:itemID="{5E52B20B-4957-47A6-BBBF-AE48DDFA8695}"/>
 </file>
</xml_diff>